<commit_message>
feat(modelos): Atualiza cursos e suporte a PPTX
Atualiza os modelos NR 18, NR 20 e Curso de injetavel a partir dos arquivos da pasta cursos.

Adiciona os modelos Lei Lucas, Rapel e Retroescavadeira, suporte a importacao/renderizacao de PPTX e sincronizacao dos modelos no banco local.

Tambem formata o campo Periodo como mes/ano por extenso e espelha campos equivalentes como nome/aluno e hora/horas.
</commit_message>
<xml_diff>
--- a/cursos/Curso de injetável.docx
+++ b/cursos/Curso de injetável.docx
@@ -300,119 +300,145 @@
           <w:sz w:val="32"/>
           <w:szCs w:val="32"/>
         </w:rPr>
-        <w:t xml:space="preserve"> na ci</w:t>
+        <w:t xml:space="preserve"> na cidade de </w:t>
+      </w:r>
+      <w:r>
+        <w:rPr>
+          <w:rFonts w:hint="default" w:ascii="Arial" w:hAnsi="Arial" w:cs="Arial"/>
+          <w:sz w:val="32"/>
+          <w:szCs w:val="32"/>
+          <w:lang w:val="pt-BR"/>
+        </w:rPr>
+        <w:t>{{CIDADE}}</w:t>
+      </w:r>
+      <w:r>
+        <w:rPr>
+          <w:rFonts w:ascii="Arial" w:hAnsi="Arial" w:cs="Arial"/>
+          <w:sz w:val="32"/>
+          <w:szCs w:val="32"/>
+        </w:rPr>
+        <w:t>, com carga horária total de 08 horas;</w:t>
+      </w:r>
+    </w:p>
+    <w:p>
+      <w:pPr>
+        <w:rPr>
+          <w:rFonts w:ascii="Arial" w:hAnsi="Arial" w:cs="Arial"/>
+        </w:rPr>
+      </w:pPr>
+      <w:r>
+        <w:rPr>
+          <w:rFonts w:ascii="Arial" w:hAnsi="Arial" w:cs="Arial"/>
+          <w:sz w:val="32"/>
+          <w:szCs w:val="32"/>
+        </w:rPr>
+        <w:t>Decreto 5.154/04 deliberação CEE 14/97 – Curso Livre de aperfeiçoamento Profissional.</w:t>
+      </w:r>
+    </w:p>
+    <w:p>
+      <w:pPr>
+        <w:jc w:val="right"/>
+        <w:rPr>
+          <w:rFonts w:ascii="Arial" w:hAnsi="Arial" w:cs="Arial"/>
+          <w:sz w:val="32"/>
+          <w:szCs w:val="32"/>
+        </w:rPr>
+      </w:pPr>
+      <w:r>
+        <w:rPr>
+          <w:rFonts w:hint="default" w:ascii="Arial" w:hAnsi="Arial" w:cs="Arial"/>
+          <w:sz w:val="32"/>
+          <w:szCs w:val="32"/>
+          <w:lang w:val="pt-BR"/>
+        </w:rPr>
+        <w:t>{{CIDADE}}</w:t>
+      </w:r>
+      <w:r>
+        <w:rPr>
+          <w:rFonts w:ascii="Arial" w:hAnsi="Arial" w:cs="Arial"/>
+          <w:sz w:val="32"/>
+          <w:szCs w:val="32"/>
+        </w:rPr>
+        <w:t xml:space="preserve"> , </w:t>
+      </w:r>
+      <w:r>
+        <w:rPr>
+          <w:rFonts w:hint="default" w:ascii="Arial" w:hAnsi="Arial" w:cs="Arial"/>
+          <w:sz w:val="32"/>
+          <w:szCs w:val="32"/>
+          <w:lang w:val="pt-BR"/>
+        </w:rPr>
+        <w:t>{{DATA_EXTENSO}}</w:t>
+      </w:r>
+      <w:r>
+        <w:rPr>
+          <w:rFonts w:ascii="Arial" w:hAnsi="Arial" w:cs="Arial"/>
+          <w:sz w:val="32"/>
+          <w:szCs w:val="32"/>
+        </w:rPr>
+        <w:t>.</w:t>
+      </w:r>
+    </w:p>
+    <w:p>
+      <w:pPr>
+        <w:rPr>
+          <w:rFonts w:ascii="Arial" w:hAnsi="Arial" w:eastAsia="Corsiva" w:cs="Arial"/>
+          <w:sz w:val="32"/>
+          <w:szCs w:val="32"/>
+        </w:rPr>
+      </w:pPr>
+    </w:p>
+    <w:p>
+      <w:pPr>
+        <w:rPr>
+          <w:rFonts w:ascii="Arial" w:hAnsi="Arial" w:eastAsia="Corsiva" w:cs="Arial"/>
+          <w:sz w:val="32"/>
+          <w:szCs w:val="32"/>
+        </w:rPr>
+      </w:pPr>
+      <w:r>
+        <w:rPr>
+          <w:rFonts w:ascii="Arial" w:hAnsi="Arial" w:eastAsia="Corsiva" w:cs="Arial"/>
+          <w:sz w:val="32"/>
+          <w:szCs w:val="32"/>
+        </w:rPr>
+        <w:t xml:space="preserve">Carlos Alexandre R.  Faria                                                                                        </w:t>
+      </w:r>
+      <w:r>
+        <w:rPr>
+          <w:rFonts w:hint="default" w:ascii="Arial" w:hAnsi="Arial" w:eastAsia="Corsiva" w:cs="Arial"/>
+          <w:sz w:val="32"/>
+          <w:szCs w:val="32"/>
+          <w:lang w:val="pt-BR"/>
+        </w:rPr>
+        <w:t>{{Nome}}</w:t>
+      </w:r>
+      <w:r>
+        <w:rPr>
+          <w:rFonts w:ascii="Arial" w:hAnsi="Arial" w:eastAsia="Corsiva" w:cs="Arial"/>
+          <w:sz w:val="32"/>
+          <w:szCs w:val="32"/>
+        </w:rPr>
+        <w:t xml:space="preserve">                                                                                                        Coren MG 001.312.974                                                                                            </w:t>
+      </w:r>
+      <w:r>
+        <w:rPr>
+          <w:rFonts w:hint="default" w:ascii="Arial" w:hAnsi="Arial" w:eastAsia="Corsiva" w:cs="Arial"/>
+          <w:sz w:val="32"/>
+          <w:szCs w:val="32"/>
+          <w:lang w:val="pt-BR"/>
+        </w:rPr>
+        <w:t xml:space="preserve"> </w:t>
       </w:r>
       <w:bookmarkStart w:id="0" w:name="_GoBack"/>
       <w:bookmarkEnd w:id="0"/>
       <w:r>
         <w:rPr>
-          <w:rFonts w:ascii="Arial" w:hAnsi="Arial" w:cs="Arial"/>
-          <w:sz w:val="32"/>
-          <w:szCs w:val="32"/>
-        </w:rPr>
-        <w:t xml:space="preserve">dade de </w:t>
-      </w:r>
-      <w:r>
-        <w:rPr>
-          <w:rFonts w:hint="default" w:ascii="Arial" w:hAnsi="Arial" w:cs="Arial"/>
-          <w:sz w:val="32"/>
-          <w:szCs w:val="32"/>
-          <w:lang w:val="pt-BR"/>
-        </w:rPr>
-        <w:t>{{CIDADE}}</w:t>
-      </w:r>
-      <w:r>
-        <w:rPr>
-          <w:rFonts w:ascii="Arial" w:hAnsi="Arial" w:cs="Arial"/>
-          <w:sz w:val="32"/>
-          <w:szCs w:val="32"/>
-        </w:rPr>
-        <w:t>, com carga horária total de 08 horas;</w:t>
-      </w:r>
-    </w:p>
-    <w:p>
-      <w:pPr>
-        <w:rPr>
-          <w:rFonts w:ascii="Arial" w:hAnsi="Arial" w:cs="Arial"/>
-        </w:rPr>
-      </w:pPr>
-      <w:r>
-        <w:rPr>
-          <w:rFonts w:ascii="Arial" w:hAnsi="Arial" w:cs="Arial"/>
-          <w:sz w:val="32"/>
-          <w:szCs w:val="32"/>
-        </w:rPr>
-        <w:t>Decreto 5.154/04 deliberação CEE 14/97 – Curso Livre de aperfeiçoamento Profissional.</w:t>
-      </w:r>
-    </w:p>
-    <w:p>
-      <w:pPr>
-        <w:jc w:val="right"/>
-        <w:rPr>
-          <w:rFonts w:ascii="Arial" w:hAnsi="Arial" w:cs="Arial"/>
-          <w:sz w:val="32"/>
-          <w:szCs w:val="32"/>
-        </w:rPr>
-      </w:pPr>
-      <w:r>
-        <w:rPr>
-          <w:rFonts w:hint="default" w:ascii="Arial" w:hAnsi="Arial" w:cs="Arial"/>
-          <w:sz w:val="32"/>
-          <w:szCs w:val="32"/>
-          <w:lang w:val="pt-BR"/>
-        </w:rPr>
-        <w:t>{{CIDADE}}</w:t>
-      </w:r>
-      <w:r>
-        <w:rPr>
-          <w:rFonts w:ascii="Arial" w:hAnsi="Arial" w:cs="Arial"/>
-          <w:sz w:val="32"/>
-          <w:szCs w:val="32"/>
-        </w:rPr>
-        <w:t xml:space="preserve"> , </w:t>
-      </w:r>
-      <w:r>
-        <w:rPr>
-          <w:rFonts w:hint="default" w:ascii="Arial" w:hAnsi="Arial" w:cs="Arial"/>
-          <w:sz w:val="32"/>
-          <w:szCs w:val="32"/>
-          <w:lang w:val="pt-BR"/>
-        </w:rPr>
-        <w:t>{{DATA_EXTENSO}}</w:t>
-      </w:r>
-      <w:r>
-        <w:rPr>
-          <w:rFonts w:ascii="Arial" w:hAnsi="Arial" w:cs="Arial"/>
-          <w:sz w:val="32"/>
-          <w:szCs w:val="32"/>
-        </w:rPr>
-        <w:t>.</w:t>
-      </w:r>
-    </w:p>
-    <w:p>
-      <w:pPr>
-        <w:rPr>
-          <w:rFonts w:ascii="Arial" w:hAnsi="Arial" w:eastAsia="Corsiva" w:cs="Arial"/>
-          <w:sz w:val="32"/>
-          <w:szCs w:val="32"/>
-        </w:rPr>
-      </w:pPr>
-    </w:p>
-    <w:p>
-      <w:pPr>
-        <w:rPr>
-          <w:rFonts w:ascii="Arial" w:hAnsi="Arial" w:eastAsia="Corsiva" w:cs="Arial"/>
-          <w:sz w:val="32"/>
-          <w:szCs w:val="32"/>
-        </w:rPr>
-      </w:pPr>
-      <w:r>
-        <w:rPr>
-          <w:rFonts w:ascii="Arial" w:hAnsi="Arial" w:eastAsia="Corsiva" w:cs="Arial"/>
-          <w:sz w:val="32"/>
-          <w:szCs w:val="32"/>
-        </w:rPr>
-        <w:t>Carlos Alexandre R.  Faria                                                                                                                                                                                                        Coren MG 001.312.974                                                                                                    Aluno(a)                                                                                                                                                                                                                                                                                                                                                                                                                                                                                                                      Reg.  CBMMG Nº F 0004348</w:t>
+          <w:rFonts w:ascii="Arial" w:hAnsi="Arial" w:eastAsia="Corsiva" w:cs="Arial"/>
+          <w:sz w:val="32"/>
+          <w:szCs w:val="32"/>
+        </w:rPr>
+        <w:t xml:space="preserve"> Aluno(a)                                                                                                                                                                                                                                                                                                                                                                                                                                                                                                                      Reg.  CBMMG Nº F 0004348</w:t>
       </w:r>
     </w:p>
     <w:p>
@@ -879,7 +905,7 @@
     <w:lsdException w:uiPriority="99" w:name="footnote text"/>
     <w:lsdException w:uiPriority="99" w:name="annotation text"/>
     <w:lsdException w:uiPriority="99" w:name="header"/>
-    <w:lsdException w:uiPriority="99" w:semiHidden="0" w:name="footer"/>
+    <w:lsdException w:qFormat="1" w:uiPriority="99" w:semiHidden="0" w:name="footer"/>
     <w:lsdException w:uiPriority="99" w:name="index heading"/>
     <w:lsdException w:qFormat="1" w:uiPriority="35" w:name="caption"/>
     <w:lsdException w:uiPriority="99" w:name="table of figures"/>
@@ -912,7 +938,7 @@
     <w:lsdException w:qFormat="1" w:unhideWhenUsed="0" w:uiPriority="10" w:semiHidden="0" w:name="Title"/>
     <w:lsdException w:uiPriority="99" w:name="Closing"/>
     <w:lsdException w:uiPriority="99" w:name="Signature"/>
-    <w:lsdException w:uiPriority="1" w:name="Default Paragraph Font"/>
+    <w:lsdException w:qFormat="1" w:uiPriority="1" w:name="Default Paragraph Font"/>
     <w:lsdException w:uiPriority="99" w:name="Body Text"/>
     <w:lsdException w:uiPriority="99" w:name="Body Text Indent"/>
     <w:lsdException w:uiPriority="99" w:name="List Continue"/>
@@ -939,7 +965,7 @@
     <w:lsdException w:uiPriority="99" w:name="Document Map"/>
     <w:lsdException w:uiPriority="99" w:name="Plain Text"/>
     <w:lsdException w:uiPriority="99" w:name="E-mail Signature"/>
-    <w:lsdException w:uiPriority="99" w:name="Normal (Web)"/>
+    <w:lsdException w:qFormat="1" w:uiPriority="99" w:name="Normal (Web)"/>
     <w:lsdException w:uiPriority="99" w:name="HTML Acronym"/>
     <w:lsdException w:uiPriority="99" w:name="HTML Address"/>
     <w:lsdException w:uiPriority="99" w:name="HTML Cite"/>
@@ -950,7 +976,7 @@
     <w:lsdException w:uiPriority="99" w:name="HTML Sample"/>
     <w:lsdException w:uiPriority="99" w:name="HTML Typewriter"/>
     <w:lsdException w:uiPriority="99" w:name="HTML Variable"/>
-    <w:lsdException w:uiPriority="99" w:name="Normal Table"/>
+    <w:lsdException w:qFormat="1" w:uiPriority="99" w:name="Normal Table"/>
     <w:lsdException w:uiPriority="99" w:name="annotation subject"/>
     <w:lsdException w:uiPriority="99" w:name="Table Simple 1"/>
     <w:lsdException w:uiPriority="99" w:name="Table Simple 2"/>
@@ -994,7 +1020,7 @@
     <w:lsdException w:uiPriority="99" w:name="Table Web 1"/>
     <w:lsdException w:uiPriority="99" w:name="Table Web 2"/>
     <w:lsdException w:uiPriority="99" w:name="Table Web 3"/>
-    <w:lsdException w:uiPriority="99" w:name="Balloon Text"/>
+    <w:lsdException w:qFormat="1" w:uiPriority="99" w:name="Balloon Text"/>
     <w:lsdException w:unhideWhenUsed="0" w:uiPriority="39" w:semiHidden="0" w:name="Table Grid"/>
     <w:lsdException w:uiPriority="99" w:name="Table Theme"/>
     <w:lsdException w:qFormat="1" w:unhideWhenUsed="0" w:uiPriority="34" w:semiHidden="0" w:name="List Paragraph"/>
@@ -1133,12 +1159,14 @@
     <w:name w:val="Default Paragraph Font"/>
     <w:semiHidden/>
     <w:unhideWhenUsed/>
+    <w:qFormat/>
     <w:uiPriority w:val="1"/>
   </w:style>
   <w:style w:type="table" w:default="1" w:styleId="9">
     <w:name w:val="Normal Table"/>
     <w:semiHidden/>
     <w:unhideWhenUsed/>
+    <w:qFormat/>
     <w:uiPriority w:val="99"/>
     <w:tblPr>
       <w:tblCellMar>
@@ -1171,6 +1199,7 @@
     <w:basedOn w:val="1"/>
     <w:semiHidden/>
     <w:unhideWhenUsed/>
+    <w:qFormat/>
     <w:uiPriority w:val="99"/>
     <w:pPr>
       <w:spacing w:before="100" w:beforeAutospacing="1" w:after="100" w:afterAutospacing="1" w:line="240" w:lineRule="auto"/>
@@ -1186,6 +1215,7 @@
     <w:basedOn w:val="1"/>
     <w:link w:val="18"/>
     <w:unhideWhenUsed/>
+    <w:qFormat/>
     <w:uiPriority w:val="99"/>
     <w:pPr>
       <w:tabs>
@@ -1201,6 +1231,7 @@
     <w:link w:val="17"/>
     <w:semiHidden/>
     <w:unhideWhenUsed/>
+    <w:qFormat/>
     <w:uiPriority w:val="99"/>
     <w:pPr>
       <w:spacing w:after="0" w:line="240" w:lineRule="auto"/>
@@ -1232,6 +1263,7 @@
   </w:style>
   <w:style w:type="table" w:customStyle="1" w:styleId="15">
     <w:name w:val="Table Normal"/>
+    <w:qFormat/>
     <w:uiPriority w:val="0"/>
     <w:tblPr>
       <w:tblCellMar>
@@ -1261,6 +1293,7 @@
     <w:basedOn w:val="8"/>
     <w:link w:val="13"/>
     <w:semiHidden/>
+    <w:qFormat/>
     <w:uiPriority w:val="99"/>
     <w:rPr>
       <w:rFonts w:ascii="Segoe UI" w:hAnsi="Segoe UI" w:eastAsia="Calibri" w:cs="Segoe UI"/>
@@ -1272,6 +1305,7 @@
     <w:name w:val="Rodapé Char"/>
     <w:basedOn w:val="8"/>
     <w:link w:val="12"/>
+    <w:qFormat/>
     <w:uiPriority w:val="99"/>
     <w:rPr>
       <w:rFonts w:ascii="Calibri" w:hAnsi="Calibri" w:eastAsia="Calibri" w:cs="Calibri"/>

</xml_diff>